<commit_message>
fix: update forensic template formatting, TOC, and dynamic UI labels
</commit_message>
<xml_diff>
--- a/public/downloads/Forensic_Investigation_Report_Template.docx
+++ b/public/downloads/Forensic_Investigation_Report_Template.docx
@@ -7,7 +7,7 @@
         <w:pStyle w:val="Title"/>
       </w:pPr>
       <w:r>
-        <w:t xml:space="preserve">ELITE FORENSIC INTELLIGENCE &amp; INVESTIGATION FRAMEWORK</w:t>
+        <w:t xml:space="preserve">FORENSIC INVESTIGATION &amp; INTELLIGENCE REPORT</w:t>
       </w:r>
     </w:p>
     <w:p>
@@ -15,7 +15,7 @@
         <w:pStyle w:val="Subtitle"/>
       </w:pPr>
       <w:r>
-        <w:t xml:space="preserve">PASS 4: GLOBAL COMPLIANCE &amp; AI-DRIVEN DISCOVERY</w:t>
+        <w:t xml:space="preserve">EXECUTIVE TEMPLATE: [Case Name / Ref Number]</w:t>
       </w:r>
     </w:p>
     <w:p>
@@ -23,7 +23,7 @@
         <w:pStyle w:val="Author"/>
       </w:pPr>
       <w:r>
-        <w:t xml:space="preserve">Forensic Technology &amp; Investigative Services</w:t>
+        <w:t xml:space="preserve">Forensic Audit &amp; Investigation Division</w:t>
       </w:r>
     </w:p>
     <w:sdt>
@@ -53,6 +53,46 @@
       </w:sdtContent>
     </w:sdt>
     <w:p>
+      <w:pPr>
+        <w:pStyle w:val="FirstParagraph"/>
+      </w:pPr>
+      <w:r>
+        <w:rPr>
+          <w:i/>
+          <w:iCs/>
+        </w:rPr>
+        <w:t xml:space="preserve">Note to User: If the Table of Contents above does not appear, right-click it and select</w:t>
+      </w:r>
+      <w:r>
+        <w:rPr>
+          <w:i/>
+          <w:iCs/>
+        </w:rPr>
+        <w:t xml:space="preserve"> </w:t>
+      </w:r>
+      <w:r>
+        <w:rPr>
+          <w:i/>
+          <w:iCs/>
+        </w:rPr>
+        <w:t xml:space="preserve">“Update Field”</w:t>
+      </w:r>
+      <w:r>
+        <w:rPr>
+          <w:i/>
+          <w:iCs/>
+        </w:rPr>
+        <w:t xml:space="preserve"> </w:t>
+      </w:r>
+      <w:r>
+        <w:rPr>
+          <w:i/>
+          <w:iCs/>
+        </w:rPr>
+        <w:t xml:space="preserve">in Microsoft Word.</w:t>
+      </w:r>
+    </w:p>
+    <w:p>
       <w:r>
         <w:br w:type="page"/>
       </w:r>
@@ -87,7 +127,7 @@
           <w:b/>
           <w:bCs/>
         </w:rPr>
-        <w:t xml:space="preserve">Expert Guidance (Pass 4 - Elite Grade):</w:t>
+        <w:t xml:space="preserve">Expert Guidance:</w:t>
       </w:r>
       <w:r>
         <w:t xml:space="preserve"> </w:t>
@@ -109,7 +149,7 @@
         <w:t xml:space="preserve"> </w:t>
       </w:r>
       <w:r>
-        <w:t xml:space="preserve">In Pass 4, we don’t just find fraud; we map it to legal risk (e.g., Nazaha Law, FCPA).</w:t>
+        <w:t xml:space="preserve">Map findings to specific legal risk (e.g., KSA Nazaha Law, FCPA).</w:t>
       </w:r>
       <w:r>
         <w:t xml:space="preserve"> </w:t>
@@ -131,7 +171,7 @@
         <w:t xml:space="preserve"> </w:t>
       </w:r>
       <w:r>
-        <w:t xml:space="preserve">Professional investigators now include a</w:t>
+        <w:t xml:space="preserve">Professional investigators include a</w:t>
       </w:r>
       <w:r>
         <w:t xml:space="preserve"> </w:t>
@@ -143,15 +183,7 @@
         <w:t xml:space="preserve"> </w:t>
       </w:r>
       <w:r>
-        <w:t xml:space="preserve">based on the quality of evidence collected.</w:t>
-      </w:r>
-    </w:p>
-    <w:p>
-      <w:pPr>
-        <w:pStyle w:val="TableCaption"/>
-      </w:pPr>
-      <w:r>
-        <w:t xml:space="preserve">Elite Investigative Dashboard</w:t>
+        <w:t xml:space="preserve">based on evidence quality.</w:t>
       </w:r>
     </w:p>
     <w:tbl>
@@ -159,7 +191,6 @@
         <w:tblStyle w:val="Table"/>
         <w:tblW w:type="auto" w:w="0"/>
         <w:tblLook w:firstRow="1" w:lastRow="0" w:firstColumn="0" w:lastColumn="0" w:noHBand="0" w:noVBand="0" w:val="0020"/>
-        <w:tblCaption w:val="Elite Investigative Dashboard"/>
       </w:tblPr>
       <w:tblGrid>
         <w:gridCol w:w="2640"/>
@@ -380,7 +411,7 @@
               <w:jc w:val="left"/>
             </w:pPr>
             <w:r>
-              <w:t xml:space="preserve">Subject A + 2 External Co-Conspirators</w:t>
+              <w:t xml:space="preserve">Subject A + 2 Co-Conspirators</w:t>
             </w:r>
           </w:p>
         </w:tc>
@@ -418,7 +449,7 @@
               <w:jc w:val="left"/>
             </w:pPr>
             <w:r>
-              <w:t xml:space="preserve">Court-Ready (Chain of Custody Verified)</w:t>
+              <w:t xml:space="preserve">Court-Ready (Verified)</w:t>
             </w:r>
           </w:p>
         </w:tc>
@@ -465,101 +496,6 @@
         <w:t xml:space="preserve">Aligning investigative findings with statutory requirements.</w:t>
       </w:r>
     </w:p>
-    <w:p>
-      <w:pPr>
-        <w:pStyle w:val="BlockText"/>
-      </w:pPr>
-      <w:r>
-        <w:rPr>
-          <w:b/>
-          <w:bCs/>
-        </w:rPr>
-        <w:t xml:space="preserve">Expert Guidance:</w:t>
-      </w:r>
-      <w:r>
-        <w:t xml:space="preserve"> </w:t>
-      </w:r>
-      <w:r>
-        <w:t xml:space="preserve">*</w:t>
-      </w:r>
-      <w:r>
-        <w:t xml:space="preserve"> </w:t>
-      </w:r>
-      <w:r>
-        <w:rPr>
-          <w:b/>
-          <w:bCs/>
-        </w:rPr>
-        <w:t xml:space="preserve">Global Standards:</w:t>
-      </w:r>
-      <w:r>
-        <w:t xml:space="preserve"> </w:t>
-      </w:r>
-      <w:r>
-        <w:t xml:space="preserve">If the entity is listed or has international operations, you MUST map findings to the</w:t>
-      </w:r>
-      <w:r>
-        <w:t xml:space="preserve"> </w:t>
-      </w:r>
-      <w:r>
-        <w:rPr>
-          <w:b/>
-          <w:bCs/>
-        </w:rPr>
-        <w:t xml:space="preserve">UK Bribery Act</w:t>
-      </w:r>
-      <w:r>
-        <w:t xml:space="preserve"> </w:t>
-      </w:r>
-      <w:r>
-        <w:t xml:space="preserve">or</w:t>
-      </w:r>
-      <w:r>
-        <w:t xml:space="preserve"> </w:t>
-      </w:r>
-      <w:r>
-        <w:rPr>
-          <w:b/>
-          <w:bCs/>
-        </w:rPr>
-        <w:t xml:space="preserve">US FCPA</w:t>
-      </w:r>
-      <w:r>
-        <w:t xml:space="preserve">.</w:t>
-      </w:r>
-      <w:r>
-        <w:t xml:space="preserve"> </w:t>
-      </w:r>
-      <w:r>
-        <w:t xml:space="preserve">*</w:t>
-      </w:r>
-      <w:r>
-        <w:t xml:space="preserve"> </w:t>
-      </w:r>
-      <w:r>
-        <w:rPr>
-          <w:b/>
-          <w:bCs/>
-        </w:rPr>
-        <w:t xml:space="preserve">Local Compliance:</w:t>
-      </w:r>
-      <w:r>
-        <w:t xml:space="preserve"> </w:t>
-      </w:r>
-      <w:r>
-        <w:t xml:space="preserve">For KSA-based entities, reference the</w:t>
-      </w:r>
-      <w:r>
-        <w:t xml:space="preserve"> </w:t>
-      </w:r>
-      <w:r>
-        <w:rPr>
-          <w:b/>
-          <w:bCs/>
-        </w:rPr>
-        <w:t xml:space="preserve">National Strategy for Maintaining Integrity and Combating Corruption.</w:t>
-      </w:r>
-    </w:p>
     <w:bookmarkStart w:id="21" w:name="statutory-violations"/>
     <w:p>
       <w:pPr>
@@ -595,13 +531,13 @@
     </w:p>
     <w:bookmarkEnd w:id="21"/>
     <w:bookmarkEnd w:id="22"/>
-    <w:bookmarkStart w:id="26" w:name="ai-advanced-link-analysis"/>
+    <w:bookmarkStart w:id="26" w:name="advanced-fraud-analytics"/>
     <w:p>
       <w:pPr>
         <w:pStyle w:val="Heading1"/>
       </w:pPr>
       <w:r>
-        <w:t xml:space="preserve">3. AI &amp; ADVANCED LINK ANALYSIS</w:t>
+        <w:t xml:space="preserve">3. ADVANCED FRAUD ANALYTICS</w:t>
       </w:r>
     </w:p>
     <w:p>
@@ -618,135 +554,101 @@
     </w:p>
     <w:p>
       <w:pPr>
-        <w:pStyle w:val="BlockText"/>
-      </w:pPr>
-      <w:r>
-        <w:rPr>
-          <w:b/>
-          <w:bCs/>
-        </w:rPr>
-        <w:t xml:space="preserve">Expert Guidance:</w:t>
-      </w:r>
-      <w:r>
-        <w:t xml:space="preserve"> </w:t>
-      </w:r>
-      <w:r>
-        <w:t xml:space="preserve">*</w:t>
-      </w:r>
-      <w:r>
-        <w:t xml:space="preserve"> </w:t>
-      </w:r>
-      <w:r>
-        <w:rPr>
-          <w:b/>
-          <w:bCs/>
-        </w:rPr>
-        <w:t xml:space="preserve">Link Analysis:</w:t>
-      </w:r>
-      <w:r>
-        <w:t xml:space="preserve"> </w:t>
-      </w:r>
-      <w:r>
-        <w:t xml:space="preserve">The chart below represents</w:t>
-      </w:r>
-      <w:r>
-        <w:t xml:space="preserve"> </w:t>
-      </w:r>
-      <w:r>
-        <w:t xml:space="preserve">“Social Network Analysis.”</w:t>
-      </w:r>
-      <w:r>
-        <w:t xml:space="preserve"> </w:t>
-      </w:r>
-      <w:r>
-        <w:t xml:space="preserve">In a real audit, this identifies</w:t>
-      </w:r>
-      <w:r>
-        <w:t xml:space="preserve"> </w:t>
-      </w:r>
-      <w:r>
-        <w:t xml:space="preserve">“Common Addresses,”</w:t>
-      </w:r>
-      <w:r>
-        <w:t xml:space="preserve"> </w:t>
-      </w:r>
-      <w:r>
-        <w:t xml:space="preserve">“Shared Phone Numbers,”</w:t>
-      </w:r>
-      <w:r>
-        <w:t xml:space="preserve"> </w:t>
-      </w:r>
-      <w:r>
-        <w:t xml:space="preserve">or</w:t>
-      </w:r>
-      <w:r>
-        <w:t xml:space="preserve"> </w:t>
-      </w:r>
-      <w:r>
-        <w:t xml:space="preserve">“Shared IP Addresses”</w:t>
-      </w:r>
-      <w:r>
-        <w:t xml:space="preserve"> </w:t>
-      </w:r>
-      <w:r>
-        <w:t xml:space="preserve">between employees and vendors.</w:t>
-      </w:r>
-      <w:r>
-        <w:t xml:space="preserve"> </w:t>
-      </w:r>
-      <w:r>
-        <w:t xml:space="preserve">*</w:t>
-      </w:r>
-      <w:r>
-        <w:t xml:space="preserve"> </w:t>
-      </w:r>
-      <w:r>
-        <w:rPr>
-          <w:b/>
-          <w:bCs/>
-        </w:rPr>
-        <w:t xml:space="preserve">NLP:</w:t>
-      </w:r>
-      <w:r>
-        <w:t xml:space="preserve"> </w:t>
-      </w:r>
-      <w:r>
-        <w:t xml:space="preserve">Mention if Natural Language Processing was used to analyze sentiment or</w:t>
-      </w:r>
-      <w:r>
-        <w:t xml:space="preserve"> </w:t>
-      </w:r>
-      <w:r>
-        <w:t xml:space="preserve">“pressure keywords”</w:t>
-      </w:r>
-      <w:r>
-        <w:t xml:space="preserve"> </w:t>
-      </w:r>
-      <w:r>
-        <w:t xml:space="preserve">in corporate emails.</w:t>
-      </w:r>
-    </w:p>
-    <w:p>
-      <w:pPr>
-        <w:pStyle w:val="FirstParagraph"/>
+        <w:pStyle w:val="BodyText"/>
       </w:pPr>
       <w:r>
         <w:drawing>
           <wp:inline>
-            <wp:extent cx="5334000" cy="3333750"/>
+            <wp:extent cx="5334000" cy="2667000"/>
             <wp:effectExtent b="0" l="0" r="0" t="0"/>
             <wp:docPr descr="" title="" id="24" name="Picture"/>
             <a:graphic>
               <a:graphicData uri="http://schemas.openxmlformats.org/drawingml/2006/picture">
                 <pic:pic>
                   <pic:nvPicPr>
-                    <pic:cNvPr descr="C:/Users/sorat/Desktop/Forensic_Investigation_Report_Template_files/figure-docx/link_analysis-1.png" id="25" name="Picture"/>
+                    <pic:cNvPr descr="C:/Users/sorat/Desktop/Forensic_Investigation_Report_Template_files/figure-docx/benfords_analysis-1.png" id="25" name="Picture"/>
                     <pic:cNvPicPr>
                       <a:picLocks noChangeArrowheads="1" noChangeAspect="1"/>
                     </pic:cNvPicPr>
                   </pic:nvPicPr>
                   <pic:blipFill>
                     <a:blip r:embed="rId23"/>
+                    <a:stretch>
+                      <a:fillRect/>
+                    </a:stretch>
+                  </pic:blipFill>
+                  <pic:spPr bwMode="auto">
+                    <a:xfrm>
+                      <a:off x="0" y="0"/>
+                      <a:ext cx="5334000" cy="2667000"/>
+                    </a:xfrm>
+                    <a:prstGeom prst="rect">
+                      <a:avLst/>
+                    </a:prstGeom>
+                    <a:noFill/>
+                    <a:ln w="9525">
+                      <a:noFill/>
+                      <a:headEnd/>
+                      <a:tailEnd/>
+                    </a:ln>
+                  </pic:spPr>
+                </pic:pic>
+              </a:graphicData>
+            </a:graphic>
+          </wp:inline>
+        </w:drawing>
+      </w:r>
+    </w:p>
+    <w:p>
+      <w:r>
+        <w:pict>
+          <v:rect style="width:0;height:1.5pt" o:hralign="center" o:hrstd="t" o:hr="t"/>
+        </w:pict>
+      </w:r>
+    </w:p>
+    <w:bookmarkEnd w:id="26"/>
+    <w:bookmarkStart w:id="30" w:name="social-network-link-analysis"/>
+    <w:p>
+      <w:pPr>
+        <w:pStyle w:val="Heading1"/>
+      </w:pPr>
+      <w:r>
+        <w:t xml:space="preserve">4. SOCIAL NETWORK LINK ANALYSIS</w:t>
+      </w:r>
+    </w:p>
+    <w:p>
+      <w:pPr>
+        <w:pStyle w:val="FirstParagraph"/>
+      </w:pPr>
+      <w:r>
+        <w:rPr>
+          <w:b/>
+          <w:bCs/>
+        </w:rPr>
+        <w:t xml:space="preserve">Uncovering hidden relationships through data science.</w:t>
+      </w:r>
+    </w:p>
+    <w:p>
+      <w:pPr>
+        <w:pStyle w:val="BodyText"/>
+      </w:pPr>
+      <w:r>
+        <w:drawing>
+          <wp:inline>
+            <wp:extent cx="5334000" cy="3333750"/>
+            <wp:effectExtent b="0" l="0" r="0" t="0"/>
+            <wp:docPr descr="" title="" id="28" name="Picture"/>
+            <a:graphic>
+              <a:graphicData uri="http://schemas.openxmlformats.org/drawingml/2006/picture">
+                <pic:pic>
+                  <pic:nvPicPr>
+                    <pic:cNvPr descr="C:/Users/sorat/Desktop/Forensic_Investigation_Report_Template_files/figure-docx/link_analysis-1.png" id="29" name="Picture"/>
+                    <pic:cNvPicPr>
+                      <a:picLocks noChangeArrowheads="1" noChangeAspect="1"/>
+                    </pic:cNvPicPr>
+                  </pic:nvPicPr>
+                  <pic:blipFill>
+                    <a:blip r:embed="rId27"/>
                     <a:stretch>
                       <a:fillRect/>
                     </a:stretch>
@@ -780,14 +682,14 @@
         </w:pict>
       </w:r>
     </w:p>
-    <w:bookmarkEnd w:id="26"/>
-    <w:bookmarkStart w:id="28" w:name="forensic-interviewing-psychology"/>
+    <w:bookmarkEnd w:id="30"/>
+    <w:bookmarkStart w:id="31" w:name="the-fraud-diamond-psychology"/>
     <w:p>
       <w:pPr>
         <w:pStyle w:val="Heading1"/>
       </w:pPr>
       <w:r>
-        <w:t xml:space="preserve">4. FORENSIC INTERVIEWING &amp; PSYCHOLOGY</w:t>
+        <w:t xml:space="preserve">5. THE FRAUD DIAMOND &amp; PSYCHOLOGY</w:t>
       </w:r>
     </w:p>
     <w:p>
@@ -799,7 +701,7 @@
           <w:b/>
           <w:bCs/>
         </w:rPr>
-        <w:t xml:space="preserve">The human element of the investigation.</w:t>
+        <w:t xml:space="preserve">Understanding the Subject.</w:t>
       </w:r>
     </w:p>
     <w:p>
@@ -833,7 +735,13 @@
         <w:t xml:space="preserve"> </w:t>
       </w:r>
       <w:r>
-        <w:t xml:space="preserve">Reference the use of the</w:t>
+        <w:t xml:space="preserve">Reference the use of the PEACE framework (Planning, Engage, Account, Closure, Evaluation).</w:t>
+      </w:r>
+      <w:r>
+        <w:t xml:space="preserve"> </w:t>
+      </w:r>
+      <w:r>
+        <w:t xml:space="preserve">*</w:t>
       </w:r>
       <w:r>
         <w:t xml:space="preserve"> </w:t>
@@ -843,86 +751,45 @@
           <w:b/>
           <w:bCs/>
         </w:rPr>
-        <w:t xml:space="preserve">PEACE</w:t>
+        <w:t xml:space="preserve">Capability:</w:t>
       </w:r>
       <w:r>
         <w:t xml:space="preserve"> </w:t>
       </w:r>
       <w:r>
-        <w:t xml:space="preserve">framework (Planning, Engage, Account, Closure, Evaluation).</w:t>
+        <w:t xml:space="preserve">Forensics analyze if the subject had the</w:t>
       </w:r>
       <w:r>
         <w:t xml:space="preserve"> </w:t>
       </w:r>
       <w:r>
-        <w:t xml:space="preserve">*</w:t>
+        <w:rPr>
+          <w:i/>
+          <w:iCs/>
+        </w:rPr>
+        <w:t xml:space="preserve">intellect</w:t>
       </w:r>
       <w:r>
         <w:t xml:space="preserve"> </w:t>
       </w:r>
       <w:r>
-        <w:rPr>
-          <w:b/>
-          <w:bCs/>
-        </w:rPr>
-        <w:t xml:space="preserve">Deception Indicators:</w:t>
+        <w:t xml:space="preserve">and</w:t>
       </w:r>
       <w:r>
         <w:t xml:space="preserve"> </w:t>
       </w:r>
       <w:r>
-        <w:t xml:space="preserve">Note physical or verbal</w:t>
+        <w:rPr>
+          <w:i/>
+          <w:iCs/>
+        </w:rPr>
+        <w:t xml:space="preserve">access</w:t>
       </w:r>
       <w:r>
         <w:t xml:space="preserve"> </w:t>
       </w:r>
       <w:r>
-        <w:t xml:space="preserve">“Leakage”</w:t>
-      </w:r>
-      <w:r>
-        <w:t xml:space="preserve"> </w:t>
-      </w:r>
-      <w:r>
-        <w:t xml:space="preserve">observed during admission-seeking interviews.</w:t>
-      </w:r>
-      <w:r>
-        <w:t xml:space="preserve"> </w:t>
-      </w:r>
-      <w:r>
-        <w:t xml:space="preserve">*</w:t>
-      </w:r>
-      <w:r>
-        <w:t xml:space="preserve"> </w:t>
-      </w:r>
-      <w:r>
-        <w:rPr>
-          <w:b/>
-          <w:bCs/>
-        </w:rPr>
-        <w:t xml:space="preserve">Miranda-style Warnings:</w:t>
-      </w:r>
-      <w:r>
-        <w:t xml:space="preserve"> </w:t>
-      </w:r>
-      <w:r>
-        <w:t xml:space="preserve">Ensure documentation that the subject participated voluntarily and was aware of company policy.</w:t>
-      </w:r>
-    </w:p>
-    <w:bookmarkStart w:id="27" w:name="interview-summaries"/>
-    <w:p>
-      <w:pPr>
-        <w:pStyle w:val="Heading2"/>
-      </w:pPr>
-      <w:r>
-        <w:t xml:space="preserve">4.1 Interview Summaries</w:t>
-      </w:r>
-    </w:p>
-    <w:p>
-      <w:pPr>
-        <w:pStyle w:val="FirstParagraph"/>
-      </w:pPr>
-      <w:r>
-        <w:t xml:space="preserve">[Detailed breakdown of the strategy used for each key subject.]</w:t>
+        <w:t xml:space="preserve">to hide the fraud.</w:t>
       </w:r>
     </w:p>
     <w:p>
@@ -932,15 +799,14 @@
         </w:pict>
       </w:r>
     </w:p>
-    <w:bookmarkEnd w:id="27"/>
-    <w:bookmarkEnd w:id="28"/>
-    <w:bookmarkStart w:id="29" w:name="digital-footprint-metadata-forensics"/>
+    <w:bookmarkEnd w:id="31"/>
+    <w:bookmarkStart w:id="32" w:name="action-plan-control-remediation"/>
     <w:p>
       <w:pPr>
         <w:pStyle w:val="Heading1"/>
       </w:pPr>
       <w:r>
-        <w:t xml:space="preserve">5. DIGITAL FOOTPRINT &amp; METADATA FORENSICS</w:t>
+        <w:t xml:space="preserve">6. ACTION PLAN &amp; CONTROL REMEDIATION</w:t>
       </w:r>
     </w:p>
     <w:p>
@@ -952,27 +818,13 @@
           <w:b/>
           <w:bCs/>
         </w:rPr>
-        <w:t xml:space="preserve">The data that cannot be deleted.</w:t>
-      </w:r>
-    </w:p>
-    <w:p>
-      <w:pPr>
-        <w:pStyle w:val="BlockText"/>
-      </w:pPr>
+        <w:t xml:space="preserve">Moving from</w:t>
+      </w:r>
       <w:r>
         <w:rPr>
           <w:b/>
           <w:bCs/>
         </w:rPr>
-        <w:t xml:space="preserve">Expert Guidance:</w:t>
-      </w:r>
-      <w:r>
-        <w:t xml:space="preserve"> </w:t>
-      </w:r>
-      <w:r>
-        <w:t xml:space="preserve">*</w:t>
-      </w:r>
-      <w:r>
         <w:t xml:space="preserve"> </w:t>
       </w:r>
       <w:r>
@@ -980,88 +832,21 @@
           <w:b/>
           <w:bCs/>
         </w:rPr>
-        <w:t xml:space="preserve">Exif Data:</w:t>
-      </w:r>
-      <w:r>
-        <w:t xml:space="preserve"> </w:t>
-      </w:r>
-      <w:r>
-        <w:t xml:space="preserve">Mention analysis of metadata on submitted PDF invoices to check for original</w:t>
-      </w:r>
-      <w:r>
-        <w:t xml:space="preserve"> </w:t>
-      </w:r>
-      <w:r>
-        <w:t xml:space="preserve">“Creation Dates.”</w:t>
-      </w:r>
-      <w:r>
-        <w:t xml:space="preserve"> </w:t>
-      </w:r>
-      <w:r>
-        <w:t xml:space="preserve">*</w:t>
-      </w:r>
-      <w:r>
-        <w:t xml:space="preserve"> </w:t>
+        <w:t xml:space="preserve">“Investigation”</w:t>
       </w:r>
       <w:r>
         <w:rPr>
           <w:b/>
           <w:bCs/>
         </w:rPr>
-        <w:t xml:space="preserve">IP Geolocation:</w:t>
-      </w:r>
-      <w:r>
         <w:t xml:space="preserve"> </w:t>
       </w:r>
-      <w:r>
-        <w:t xml:space="preserve">Correlating the time an invoice was</w:t>
-      </w:r>
-      <w:r>
-        <w:t xml:space="preserve"> </w:t>
-      </w:r>
-      <w:r>
-        <w:t xml:space="preserve">“Authorized”</w:t>
-      </w:r>
-      <w:r>
-        <w:t xml:space="preserve"> </w:t>
-      </w:r>
-      <w:r>
-        <w:t xml:space="preserve">in the ERP with the Subject’s known travel logs.</w:t>
-      </w:r>
-    </w:p>
-    <w:p>
-      <w:r>
-        <w:pict>
-          <v:rect style="width:0;height:1.5pt" o:hralign="center" o:hrstd="t" o:hr="t"/>
-        </w:pict>
-      </w:r>
-    </w:p>
-    <w:bookmarkEnd w:id="29"/>
-    <w:bookmarkStart w:id="30" w:name="strategic-remediation-future-proofing"/>
-    <w:p>
-      <w:pPr>
-        <w:pStyle w:val="Heading1"/>
-      </w:pPr>
-      <w:r>
-        <w:t xml:space="preserve">6. STRATEGIC REMEDIATION &amp;</w:t>
-      </w:r>
-      <w:r>
-        <w:t xml:space="preserve"> </w:t>
-      </w:r>
-      <w:r>
-        <w:t xml:space="preserve">“FUTURE-PROOFING”</w:t>
-      </w:r>
-    </w:p>
-    <w:p>
-      <w:pPr>
-        <w:pStyle w:val="FirstParagraph"/>
-      </w:pPr>
       <w:r>
         <w:rPr>
           <w:b/>
           <w:bCs/>
         </w:rPr>
-        <w:t xml:space="preserve">Moving from</w:t>
+        <w:t xml:space="preserve">to</w:t>
       </w:r>
       <w:r>
         <w:rPr>
@@ -1075,57 +860,21 @@
           <w:b/>
           <w:bCs/>
         </w:rPr>
-        <w:t xml:space="preserve">“Cure”</w:t>
-      </w:r>
-      <w:r>
-        <w:rPr>
-          <w:b/>
-          <w:bCs/>
-        </w:rPr>
-        <w:t xml:space="preserve"> </w:t>
-      </w:r>
-      <w:r>
-        <w:rPr>
-          <w:b/>
-          <w:bCs/>
-        </w:rPr>
-        <w:t xml:space="preserve">to</w:t>
-      </w:r>
-      <w:r>
-        <w:rPr>
-          <w:b/>
-          <w:bCs/>
-        </w:rPr>
-        <w:t xml:space="preserve"> </w:t>
-      </w:r>
-      <w:r>
-        <w:rPr>
-          <w:b/>
-          <w:bCs/>
-        </w:rPr>
-        <w:t xml:space="preserve">“Immunity.”</w:t>
-      </w:r>
-    </w:p>
-    <w:p>
-      <w:pPr>
-        <w:pStyle w:val="TableCaption"/>
-      </w:pPr>
-      <w:r>
-        <w:t xml:space="preserve">Strategic AI-Driven Remediation Matrix</w:t>
+        <w:t xml:space="preserve">“Prevention.”</w:t>
       </w:r>
     </w:p>
     <w:tbl>
       <w:tblPr>
         <w:tblStyle w:val="Table"/>
-        <w:tblW w:type="auto" w:w="0"/>
+        <w:tblW w:type="pct" w:w="5000"/>
+        <w:tblLayout w:type="fixed"/>
         <w:tblLook w:firstRow="1" w:lastRow="0" w:firstColumn="0" w:lastColumn="0" w:noHBand="0" w:noVBand="0" w:val="0020"/>
-        <w:tblCaption w:val="Strategic AI-Driven Remediation Matrix"/>
       </w:tblPr>
       <w:tblGrid>
-        <w:gridCol w:w="1980"/>
-        <w:gridCol w:w="1980"/>
-        <w:gridCol w:w="1980"/>
-        <w:gridCol w:w="1980"/>
+        <w:gridCol w:w="1643"/>
+        <w:gridCol w:w="3287"/>
+        <w:gridCol w:w="1793"/>
+        <w:gridCol w:w="1195"/>
       </w:tblGrid>
       <w:tr>
         <w:trPr>
@@ -1139,31 +888,31 @@
               <w:jc w:val="left"/>
             </w:pPr>
             <w:r>
-              <w:t xml:space="preserve">Risk_Area</w:t>
-            </w:r>
-          </w:p>
-        </w:tc>
-        <w:tc>
-          <w:tcPr/>
-          <w:p>
-            <w:pPr>
-              <w:pStyle w:val="Compact"/>
-              <w:jc w:val="left"/>
-            </w:pPr>
-            <w:r>
-              <w:t xml:space="preserve">AI_Fix</w:t>
-            </w:r>
-          </w:p>
-        </w:tc>
-        <w:tc>
-          <w:tcPr/>
-          <w:p>
-            <w:pPr>
-              <w:pStyle w:val="Compact"/>
-              <w:jc w:val="left"/>
-            </w:pPr>
-            <w:r>
-              <w:t xml:space="preserve">Impact_ROI</w:t>
+              <w:t xml:space="preserve">Risk Area</w:t>
+            </w:r>
+          </w:p>
+        </w:tc>
+        <w:tc>
+          <w:tcPr/>
+          <w:p>
+            <w:pPr>
+              <w:pStyle w:val="Compact"/>
+              <w:jc w:val="left"/>
+            </w:pPr>
+            <w:r>
+              <w:t xml:space="preserve">Remediation Strategy</w:t>
+            </w:r>
+          </w:p>
+        </w:tc>
+        <w:tc>
+          <w:tcPr/>
+          <w:p>
+            <w:pPr>
+              <w:pStyle w:val="Compact"/>
+              <w:jc w:val="left"/>
+            </w:pPr>
+            <w:r>
+              <w:t xml:space="preserve">ROI Impact</w:t>
             </w:r>
           </w:p>
         </w:tc>
@@ -1338,14 +1087,39 @@
         </w:pict>
       </w:r>
     </w:p>
-    <w:bookmarkEnd w:id="30"/>
-    <w:bookmarkStart w:id="31" w:name="appendices-the-court-vault"/>
+    <w:bookmarkEnd w:id="32"/>
+    <w:bookmarkStart w:id="33" w:name="conclusion-expert-opinion"/>
     <w:p>
       <w:pPr>
         <w:pStyle w:val="Heading1"/>
       </w:pPr>
       <w:r>
-        <w:t xml:space="preserve">7. APPENDICES (THE COURT VAULT)</w:t>
+        <w:t xml:space="preserve">7. CONCLUSION &amp; EXPERT OPINION</w:t>
+      </w:r>
+    </w:p>
+    <w:p>
+      <w:pPr>
+        <w:pStyle w:val="FirstParagraph"/>
+      </w:pPr>
+      <w:r>
+        <w:t xml:space="preserve">[Final statement on the reliability of findings and recommended legal/disciplinary path.]</w:t>
+      </w:r>
+    </w:p>
+    <w:p>
+      <w:r>
+        <w:pict>
+          <v:rect style="width:0;height:1.5pt" o:hralign="center" o:hrstd="t" o:hr="t"/>
+        </w:pict>
+      </w:r>
+    </w:p>
+    <w:bookmarkEnd w:id="33"/>
+    <w:bookmarkStart w:id="34" w:name="appendices"/>
+    <w:p>
+      <w:pPr>
+        <w:pStyle w:val="Heading1"/>
+      </w:pPr>
+      <w:r>
+        <w:t xml:space="preserve">8. APPENDICES</w:t>
       </w:r>
     </w:p>
     <w:p>
@@ -1421,29 +1195,10 @@
         <w:t xml:space="preserve">Appendix D</w:t>
       </w:r>
       <w:r>
-        <w:t xml:space="preserve">: External Intelligence (Open Source Intelligence - OSINT)</w:t>
-      </w:r>
-    </w:p>
-    <w:p>
-      <w:pPr>
-        <w:pStyle w:val="Compact"/>
-        <w:numPr>
-          <w:ilvl w:val="0"/>
-          <w:numId w:val="1001"/>
-        </w:numPr>
-      </w:pPr>
-      <w:r>
-        <w:rPr>
-          <w:b/>
-          <w:bCs/>
-        </w:rPr>
-        <w:t xml:space="preserve">Appendix E</w:t>
-      </w:r>
-      <w:r>
-        <w:t xml:space="preserve">: Expert Witness Statement</w:t>
-      </w:r>
-    </w:p>
-    <w:bookmarkEnd w:id="31"/>
+        <w:t xml:space="preserve">: External Intelligence (OSINT)</w:t>
+      </w:r>
+    </w:p>
+    <w:bookmarkEnd w:id="34"/>
     <w:sectPr>
       <w:footnotePr>
         <w:numRestart w:val="eachSect"/>

</xml_diff>